<commit_message>
Continue cvss and create example for POC
</commit_message>
<xml_diff>
--- a/AppSec/44_CVE_CWE_CVSS/CVE_CWE_CVSS.docx
+++ b/AppSec/44_CVE_CWE_CVSS/CVE_CWE_CVSS.docx
@@ -98,14 +98,12 @@
       <w:r>
         <w:t xml:space="preserve">используется запрещенная конструкция </w:t>
       </w:r>
-      <w:proofErr w:type="spellStart"/>
       <w:r>
         <w:rPr>
           <w:lang w:val="en-US"/>
         </w:rPr>
         <w:t>InnerHTML</w:t>
       </w:r>
-      <w:proofErr w:type="spellEnd"/>
       <w:r>
         <w:t xml:space="preserve"> </w:t>
       </w:r>
@@ -164,13 +162,46 @@
         <w:t xml:space="preserve"> Content Security Policy (CSP) </w:t>
       </w:r>
       <w:r>
-        <w:t>и</w:t>
-      </w:r>
-      <w:r>
-        <w:rPr>
-          <w:lang w:val="en-US"/>
-        </w:rPr>
-        <w:t xml:space="preserve"> X-Content-Type-Options. </w:t>
+        <w:rPr>
+          <w:lang w:val="en-US"/>
+        </w:rPr>
+        <w:t>–</w:t>
+      </w:r>
+      <w:r>
+        <w:rPr>
+          <w:lang w:val="en-US"/>
+        </w:rPr>
+        <w:t xml:space="preserve"> </w:t>
+      </w:r>
+      <w:r>
+        <w:t>защита</w:t>
+      </w:r>
+      <w:r>
+        <w:rPr>
+          <w:lang w:val="en-US"/>
+        </w:rPr>
+        <w:t xml:space="preserve"> </w:t>
+      </w:r>
+      <w:r>
+        <w:t>от</w:t>
+      </w:r>
+      <w:r>
+        <w:rPr>
+          <w:lang w:val="en-US"/>
+        </w:rPr>
+        <w:t xml:space="preserve"> </w:t>
+      </w:r>
+      <w:r>
+        <w:rPr>
+          <w:lang w:val="en-US"/>
+        </w:rPr>
+        <w:t>XSS</w:t>
+      </w:r>
+      <w:r>
+        <w:rPr>
+          <w:lang w:val="en-US"/>
+        </w:rPr>
+        <w:t xml:space="preserve">. </w:t>
       </w:r>
       <w:r>
         <w:t xml:space="preserve">Так же нет заголовка </w:t>
@@ -235,71 +266,145 @@
       <w:pPr>
         <w:ind w:firstLine="708"/>
         <w:jc w:val="both"/>
-        <w:rPr>
-          <w:lang w:val="en-US"/>
-        </w:rPr>
       </w:pPr>
       <w:r>
         <w:t>Использование</w:t>
       </w:r>
       <w:r>
-        <w:rPr>
-          <w:lang w:val="en-US"/>
-        </w:rPr>
-        <w:t xml:space="preserve"> </w:t>
-      </w:r>
-      <w:proofErr w:type="spellStart"/>
+        <w:t xml:space="preserve"> </w:t>
+      </w:r>
       <w:r>
         <w:rPr>
           <w:lang w:val="en-US"/>
         </w:rPr>
         <w:t>InnerHTML</w:t>
       </w:r>
-      <w:proofErr w:type="spellEnd"/>
-      <w:r>
-        <w:rPr>
-          <w:lang w:val="en-US"/>
-        </w:rPr>
-        <w:t xml:space="preserve"> – CVE-2026-1</w:t>
+      <w:r>
+        <w:t xml:space="preserve"> – </w:t>
+      </w:r>
+      <w:r>
+        <w:rPr>
+          <w:lang w:val="en-US"/>
+        </w:rPr>
+        <w:t>CVE</w:t>
+      </w:r>
+      <w:r>
+        <w:t>-2026-1</w:t>
+      </w:r>
+      <w:r>
+        <w:t xml:space="preserve"> – </w:t>
+      </w:r>
+      <w:r>
+        <w:rPr>
+          <w:highlight w:val="green"/>
+        </w:rPr>
+        <w:t xml:space="preserve">уязвимость </w:t>
+      </w:r>
+      <w:r>
+        <w:rPr>
+          <w:highlight w:val="green"/>
+          <w:lang w:val="en-US"/>
+        </w:rPr>
+        <w:t>html</w:t>
+      </w:r>
+      <w:r>
+        <w:rPr>
+          <w:highlight w:val="green"/>
+        </w:rPr>
+        <w:t xml:space="preserve"> контента</w:t>
       </w:r>
     </w:p>
     <w:p>
       <w:pPr>
         <w:ind w:firstLine="708"/>
         <w:jc w:val="both"/>
-        <w:rPr>
-          <w:lang w:val="en-US"/>
-        </w:rPr>
-      </w:pPr>
-      <w:r>
-        <w:t>Нет</w:t>
-      </w:r>
-      <w:r>
-        <w:rPr>
-          <w:lang w:val="en-US"/>
-        </w:rPr>
+      </w:pPr>
+      <w:r>
+        <w:t>Н</w:t>
+      </w:r>
+      <w:r>
+        <w:t>ет</w:t>
+      </w:r>
+      <w:r>
         <w:t xml:space="preserve"> </w:t>
       </w:r>
       <w:r>
         <w:t>заголовка</w:t>
       </w:r>
       <w:r>
-        <w:rPr>
-          <w:lang w:val="en-US"/>
-        </w:rPr>
-        <w:t xml:space="preserve"> Content Security Policy (CSP)</w:t>
-      </w:r>
-      <w:r>
-        <w:rPr>
-          <w:lang w:val="en-US"/>
-        </w:rPr>
+        <w:t xml:space="preserve"> </w:t>
+      </w:r>
+      <w:r>
+        <w:rPr>
+          <w:lang w:val="en-US"/>
+        </w:rPr>
+        <w:t>Header</w:t>
+      </w:r>
+      <w:r>
+        <w:t xml:space="preserve"> </w:t>
+      </w:r>
+      <w:r>
+        <w:t>с</w:t>
+      </w:r>
+      <w:r>
+        <w:t xml:space="preserve"> </w:t>
+      </w:r>
+      <w:r>
+        <w:t>параметром</w:t>
+      </w:r>
+      <w:r>
+        <w:t xml:space="preserve"> </w:t>
+      </w:r>
+      <w:r>
+        <w:rPr>
+          <w:lang w:val="en-US"/>
+        </w:rPr>
+        <w:t>x</w:t>
+      </w:r>
+      <w:r>
+        <w:t>-</w:t>
+      </w:r>
+      <w:r>
+        <w:rPr>
+          <w:lang w:val="en-US"/>
+        </w:rPr>
+        <w:t>frame</w:t>
+      </w:r>
+      <w:r>
+        <w:t>-</w:t>
+      </w:r>
+      <w:r>
+        <w:rPr>
+          <w:lang w:val="en-US"/>
+        </w:rPr>
+        <w:t>options</w:t>
+      </w:r>
+      <w:r>
         <w:t xml:space="preserve"> – </w:t>
       </w:r>
       <w:r>
         <w:rPr>
           <w:lang w:val="en-US"/>
         </w:rPr>
-        <w:t>CVE-2026-2</w:t>
+        <w:t>CVE</w:t>
+      </w:r>
+      <w:r>
+        <w:t>-2206-4</w:t>
+      </w:r>
+      <w:r>
+        <w:t xml:space="preserve"> </w:t>
+      </w:r>
+      <w:r>
+        <w:t>–</w:t>
+      </w:r>
+      <w:r>
+        <w:t xml:space="preserve"> </w:t>
+      </w:r>
+      <w:r>
+        <w:rPr>
+          <w:highlight w:val="cyan"/>
+        </w:rPr>
+        <w:t>уязвимость сервера.</w:t>
       </w:r>
     </w:p>
     <w:p>
@@ -311,34 +416,277 @@
         </w:rPr>
       </w:pPr>
       <w:r>
-        <w:t>Нет</w:t>
-      </w:r>
-      <w:r>
-        <w:rPr>
-          <w:lang w:val="en-US"/>
-        </w:rPr>
-        <w:t xml:space="preserve"> </w:t>
-      </w:r>
-      <w:r>
-        <w:t>заголовка</w:t>
-      </w:r>
-      <w:r>
-        <w:rPr>
-          <w:lang w:val="en-US"/>
-        </w:rPr>
-        <w:t xml:space="preserve"> X-Content-Type-Options</w:t>
-      </w:r>
-      <w:r>
-        <w:rPr>
-          <w:lang w:val="en-US"/>
-        </w:rPr>
-        <w:t xml:space="preserve"> –</w:t>
-      </w:r>
-      <w:r>
-        <w:rPr>
-          <w:lang w:val="en-US"/>
-        </w:rPr>
-        <w:t xml:space="preserve"> CVE-2026-3</w:t>
+        <w:t xml:space="preserve">Для определения </w:t>
+      </w:r>
+      <w:r>
+        <w:rPr>
+          <w:lang w:val="en-US"/>
+        </w:rPr>
+        <w:t>CWE</w:t>
+      </w:r>
+      <w:r>
+        <w:t xml:space="preserve"> </w:t>
+      </w:r>
+      <w:r>
+        <w:t xml:space="preserve">воспользуемся </w:t>
+      </w:r>
+      <w:r>
+        <w:rPr>
+          <w:lang w:val="en-US"/>
+        </w:rPr>
+        <w:t>ZAP</w:t>
+      </w:r>
+      <w:r>
+        <w:t xml:space="preserve">. </w:t>
+      </w:r>
+      <w:r>
+        <w:t>Использование</w:t>
+      </w:r>
+      <w:r>
+        <w:t xml:space="preserve"> </w:t>
+      </w:r>
+      <w:r>
+        <w:rPr>
+          <w:lang w:val="en-US"/>
+        </w:rPr>
+        <w:t>InnerHTML</w:t>
+      </w:r>
+      <w:r>
+        <w:t xml:space="preserve"> – </w:t>
+      </w:r>
+      <w:r>
+        <w:rPr>
+          <w:lang w:val="en-US"/>
+        </w:rPr>
+        <w:t>CVE</w:t>
+      </w:r>
+      <w:r>
+        <w:t xml:space="preserve">-2026-1 </w:t>
+      </w:r>
+      <w:r>
+        <w:t xml:space="preserve">относится к </w:t>
+      </w:r>
+      <w:r>
+        <w:rPr>
+          <w:lang w:val="en-US"/>
+        </w:rPr>
+        <w:t>CWE</w:t>
+      </w:r>
+      <w:r>
+        <w:t>-</w:t>
+      </w:r>
+      <w:r>
+        <w:t xml:space="preserve">79. </w:t>
+      </w:r>
+      <w:r>
+        <w:rPr>
+          <w:lang w:val="en-US"/>
+        </w:rPr>
+        <w:t>Content</w:t>
+      </w:r>
+      <w:r>
+        <w:rPr>
+          <w:lang w:val="en-US"/>
+        </w:rPr>
+        <w:t xml:space="preserve"> </w:t>
+      </w:r>
+      <w:r>
+        <w:rPr>
+          <w:lang w:val="en-US"/>
+        </w:rPr>
+        <w:t>Security</w:t>
+      </w:r>
+      <w:r>
+        <w:rPr>
+          <w:lang w:val="en-US"/>
+        </w:rPr>
+        <w:t xml:space="preserve"> </w:t>
+      </w:r>
+      <w:r>
+        <w:rPr>
+          <w:lang w:val="en-US"/>
+        </w:rPr>
+        <w:t>Policy</w:t>
+      </w:r>
+      <w:r>
+        <w:rPr>
+          <w:lang w:val="en-US"/>
+        </w:rPr>
+        <w:t xml:space="preserve"> (</w:t>
+      </w:r>
+      <w:r>
+        <w:rPr>
+          <w:lang w:val="en-US"/>
+        </w:rPr>
+        <w:t>CSP</w:t>
+      </w:r>
+      <w:r>
+        <w:rPr>
+          <w:lang w:val="en-US"/>
+        </w:rPr>
+        <w:t xml:space="preserve">) – </w:t>
+      </w:r>
+      <w:r>
+        <w:rPr>
+          <w:lang w:val="en-US"/>
+        </w:rPr>
+        <w:t>CVE</w:t>
+      </w:r>
+      <w:r>
+        <w:rPr>
+          <w:lang w:val="en-US"/>
+        </w:rPr>
+        <w:t>-2026-</w:t>
+      </w:r>
+      <w:r>
+        <w:rPr>
+          <w:lang w:val="en-US"/>
+        </w:rPr>
+        <w:t>2</w:t>
+      </w:r>
+      <w:r>
+        <w:rPr>
+          <w:lang w:val="en-US"/>
+        </w:rPr>
+        <w:t xml:space="preserve"> </w:t>
+      </w:r>
+      <w:r>
+        <w:t>относ</w:t>
+      </w:r>
+      <w:r>
+        <w:t>и</w:t>
+      </w:r>
+      <w:r>
+        <w:t>тся</w:t>
+      </w:r>
+      <w:r>
+        <w:rPr>
+          <w:lang w:val="en-US"/>
+        </w:rPr>
+        <w:t xml:space="preserve"> </w:t>
+      </w:r>
+      <w:r>
+        <w:t>к</w:t>
+      </w:r>
+      <w:r>
+        <w:rPr>
+          <w:lang w:val="en-US"/>
+        </w:rPr>
+        <w:t xml:space="preserve"> </w:t>
+      </w:r>
+      <w:r>
+        <w:rPr>
+          <w:lang w:val="en-US"/>
+        </w:rPr>
+        <w:t>CWE</w:t>
+      </w:r>
+      <w:r>
+        <w:rPr>
+          <w:lang w:val="en-US"/>
+        </w:rPr>
+        <w:t>-</w:t>
+      </w:r>
+      <w:r>
+        <w:rPr>
+          <w:lang w:val="en-US"/>
+        </w:rPr>
+        <w:t xml:space="preserve">693. </w:t>
+      </w:r>
+      <w:r>
+        <w:rPr>
+          <w:lang w:val="en-US"/>
+        </w:rPr>
+        <w:t>x</w:t>
+      </w:r>
+      <w:r>
+        <w:rPr>
+          <w:lang w:val="en-US"/>
+        </w:rPr>
+        <w:t>-</w:t>
+      </w:r>
+      <w:r>
+        <w:rPr>
+          <w:lang w:val="en-US"/>
+        </w:rPr>
+        <w:t>frame</w:t>
+      </w:r>
+      <w:r>
+        <w:rPr>
+          <w:lang w:val="en-US"/>
+        </w:rPr>
+        <w:t>-</w:t>
+      </w:r>
+      <w:r>
+        <w:rPr>
+          <w:lang w:val="en-US"/>
+        </w:rPr>
+        <w:t>options</w:t>
+      </w:r>
+      <w:r>
+        <w:rPr>
+          <w:lang w:val="en-US"/>
+        </w:rPr>
+        <w:t xml:space="preserve"> – </w:t>
+      </w:r>
+      <w:r>
+        <w:rPr>
+          <w:lang w:val="en-US"/>
+        </w:rPr>
+        <w:t>CVE</w:t>
+      </w:r>
+      <w:r>
+        <w:rPr>
+          <w:lang w:val="en-US"/>
+        </w:rPr>
+        <w:t>-2206-</w:t>
+      </w:r>
+      <w:r>
+        <w:rPr>
+          <w:lang w:val="en-US"/>
+        </w:rPr>
+        <w:t>3</w:t>
+      </w:r>
+      <w:r>
+        <w:rPr>
+          <w:lang w:val="en-US"/>
+        </w:rPr>
+        <w:t xml:space="preserve"> </w:t>
+      </w:r>
+      <w:r>
+        <w:t>относится</w:t>
+      </w:r>
+      <w:r>
+        <w:rPr>
+          <w:lang w:val="en-US"/>
+        </w:rPr>
+        <w:t xml:space="preserve"> </w:t>
+      </w:r>
+      <w:r>
+        <w:t>к</w:t>
+      </w:r>
+      <w:r>
+        <w:rPr>
+          <w:lang w:val="en-US"/>
+        </w:rPr>
+        <w:t xml:space="preserve"> </w:t>
+      </w:r>
+      <w:r>
+        <w:rPr>
+          <w:lang w:val="en-US"/>
+        </w:rPr>
+        <w:t>CWE</w:t>
+      </w:r>
+      <w:r>
+        <w:rPr>
+          <w:lang w:val="en-US"/>
+        </w:rPr>
+        <w:t>-</w:t>
+      </w:r>
+      <w:r>
+        <w:rPr>
+          <w:lang w:val="en-US"/>
+        </w:rPr>
+        <w:t xml:space="preserve">1021. </w:t>
       </w:r>
     </w:p>
     <w:p>
@@ -347,429 +695,22 @@
         <w:jc w:val="both"/>
       </w:pPr>
       <w:r>
-        <w:t>Н</w:t>
-      </w:r>
-      <w:r>
-        <w:t xml:space="preserve">ет заголовка </w:t>
-      </w:r>
-      <w:r>
-        <w:rPr>
-          <w:lang w:val="en-US"/>
-        </w:rPr>
-        <w:t>Header</w:t>
-      </w:r>
-      <w:r>
-        <w:t xml:space="preserve"> </w:t>
-      </w:r>
-      <w:r>
-        <w:t xml:space="preserve">с параметром </w:t>
-      </w:r>
-      <w:r>
-        <w:t>x-</w:t>
-      </w:r>
-      <w:proofErr w:type="spellStart"/>
-      <w:r>
-        <w:t>frame</w:t>
-      </w:r>
-      <w:proofErr w:type="spellEnd"/>
-      <w:r>
-        <w:t>-</w:t>
-      </w:r>
-      <w:proofErr w:type="spellStart"/>
-      <w:r>
-        <w:t>options</w:t>
-      </w:r>
-      <w:proofErr w:type="spellEnd"/>
-      <w:r>
-        <w:t xml:space="preserve"> </w:t>
-      </w:r>
-      <w:r>
-        <w:t>–</w:t>
-      </w:r>
-      <w:r>
-        <w:t xml:space="preserve"> </w:t>
-      </w:r>
-      <w:r>
-        <w:rPr>
-          <w:lang w:val="en-US"/>
-        </w:rPr>
-        <w:t>CVE</w:t>
-      </w:r>
-      <w:r>
-        <w:t>-2206-</w:t>
-      </w:r>
-      <w:r>
-        <w:t>4</w:t>
+        <w:t xml:space="preserve">Далее оценим критичность риска </w:t>
+      </w:r>
+      <w:r>
+        <w:rPr>
+          <w:lang w:val="en-US"/>
+        </w:rPr>
+        <w:t>CVSS</w:t>
+      </w:r>
+      <w:r>
+        <w:t>:</w:t>
       </w:r>
     </w:p>
     <w:p>
       <w:pPr>
         <w:ind w:firstLine="708"/>
         <w:jc w:val="both"/>
-      </w:pPr>
-      <w:r>
-        <w:t xml:space="preserve">Для определения </w:t>
-      </w:r>
-      <w:r>
-        <w:rPr>
-          <w:lang w:val="en-US"/>
-        </w:rPr>
-        <w:t>CWE</w:t>
-      </w:r>
-      <w:r>
-        <w:t xml:space="preserve"> </w:t>
-      </w:r>
-      <w:r>
-        <w:t xml:space="preserve">воспользуемся </w:t>
-      </w:r>
-      <w:r>
-        <w:rPr>
-          <w:lang w:val="en-US"/>
-        </w:rPr>
-        <w:t>ZAP</w:t>
-      </w:r>
-      <w:r>
-        <w:t xml:space="preserve">. </w:t>
-      </w:r>
-      <w:r>
-        <w:t>Использование</w:t>
-      </w:r>
-      <w:r>
-        <w:t xml:space="preserve"> </w:t>
-      </w:r>
-      <w:proofErr w:type="spellStart"/>
-      <w:r>
-        <w:rPr>
-          <w:lang w:val="en-US"/>
-        </w:rPr>
-        <w:t>InnerHTML</w:t>
-      </w:r>
-      <w:proofErr w:type="spellEnd"/>
-      <w:r>
-        <w:t xml:space="preserve"> – </w:t>
-      </w:r>
-      <w:r>
-        <w:rPr>
-          <w:lang w:val="en-US"/>
-        </w:rPr>
-        <w:t>CVE</w:t>
-      </w:r>
-      <w:r>
-        <w:t xml:space="preserve">-2026-1 </w:t>
-      </w:r>
-      <w:r>
-        <w:t xml:space="preserve">относится к </w:t>
-      </w:r>
-      <w:r>
-        <w:rPr>
-          <w:lang w:val="en-US"/>
-        </w:rPr>
-        <w:t>CWE</w:t>
-      </w:r>
-      <w:r>
-        <w:t>-</w:t>
-      </w:r>
-      <w:r>
-        <w:t xml:space="preserve">79. </w:t>
-      </w:r>
-      <w:r>
-        <w:rPr>
-          <w:lang w:val="en-US"/>
-        </w:rPr>
-        <w:t>Content</w:t>
-      </w:r>
-      <w:r>
-        <w:rPr>
-          <w:lang w:val="en-US"/>
-        </w:rPr>
-        <w:t xml:space="preserve"> </w:t>
-      </w:r>
-      <w:r>
-        <w:rPr>
-          <w:lang w:val="en-US"/>
-        </w:rPr>
-        <w:t>Security</w:t>
-      </w:r>
-      <w:r>
-        <w:rPr>
-          <w:lang w:val="en-US"/>
-        </w:rPr>
-        <w:t xml:space="preserve"> </w:t>
-      </w:r>
-      <w:r>
-        <w:rPr>
-          <w:lang w:val="en-US"/>
-        </w:rPr>
-        <w:t>Policy</w:t>
-      </w:r>
-      <w:r>
-        <w:rPr>
-          <w:lang w:val="en-US"/>
-        </w:rPr>
-        <w:t xml:space="preserve"> (</w:t>
-      </w:r>
-      <w:r>
-        <w:rPr>
-          <w:lang w:val="en-US"/>
-        </w:rPr>
-        <w:t>CSP</w:t>
-      </w:r>
-      <w:r>
-        <w:rPr>
-          <w:lang w:val="en-US"/>
-        </w:rPr>
-        <w:t xml:space="preserve">) – </w:t>
-      </w:r>
-      <w:r>
-        <w:rPr>
-          <w:lang w:val="en-US"/>
-        </w:rPr>
-        <w:t>CVE</w:t>
-      </w:r>
-      <w:r>
-        <w:rPr>
-          <w:lang w:val="en-US"/>
-        </w:rPr>
-        <w:t>-2026-</w:t>
-      </w:r>
-      <w:r>
-        <w:rPr>
-          <w:lang w:val="en-US"/>
-        </w:rPr>
-        <w:t>2</w:t>
-      </w:r>
-      <w:r>
-        <w:rPr>
-          <w:lang w:val="en-US"/>
-        </w:rPr>
-        <w:t xml:space="preserve"> </w:t>
-      </w:r>
-      <w:r>
-        <w:t>и</w:t>
-      </w:r>
-      <w:r>
-        <w:rPr>
-          <w:lang w:val="en-US"/>
-        </w:rPr>
-        <w:t xml:space="preserve"> </w:t>
-      </w:r>
-      <w:r>
-        <w:rPr>
-          <w:lang w:val="en-US"/>
-        </w:rPr>
-        <w:t>X</w:t>
-      </w:r>
-      <w:r>
-        <w:rPr>
-          <w:lang w:val="en-US"/>
-        </w:rPr>
-        <w:t>-</w:t>
-      </w:r>
-      <w:r>
-        <w:rPr>
-          <w:lang w:val="en-US"/>
-        </w:rPr>
-        <w:t>Content</w:t>
-      </w:r>
-      <w:r>
-        <w:rPr>
-          <w:lang w:val="en-US"/>
-        </w:rPr>
-        <w:t>-</w:t>
-      </w:r>
-      <w:r>
-        <w:rPr>
-          <w:lang w:val="en-US"/>
-        </w:rPr>
-        <w:t>Type</w:t>
-      </w:r>
-      <w:r>
-        <w:rPr>
-          <w:lang w:val="en-US"/>
-        </w:rPr>
-        <w:t>-</w:t>
-      </w:r>
-      <w:r>
-        <w:rPr>
-          <w:lang w:val="en-US"/>
-        </w:rPr>
-        <w:t>Options</w:t>
-      </w:r>
-      <w:r>
-        <w:rPr>
-          <w:lang w:val="en-US"/>
-        </w:rPr>
-        <w:t xml:space="preserve"> – </w:t>
-      </w:r>
-      <w:r>
-        <w:rPr>
-          <w:lang w:val="en-US"/>
-        </w:rPr>
-        <w:t>CVE</w:t>
-      </w:r>
-      <w:r>
-        <w:rPr>
-          <w:lang w:val="en-US"/>
-        </w:rPr>
-        <w:t>-2026-</w:t>
-      </w:r>
-      <w:r>
-        <w:rPr>
-          <w:lang w:val="en-US"/>
-        </w:rPr>
-        <w:t>3</w:t>
-      </w:r>
-      <w:r>
-        <w:rPr>
-          <w:lang w:val="en-US"/>
-        </w:rPr>
-        <w:t xml:space="preserve"> </w:t>
-      </w:r>
-      <w:r>
-        <w:t>относятся</w:t>
-      </w:r>
-      <w:r>
-        <w:rPr>
-          <w:lang w:val="en-US"/>
-        </w:rPr>
-        <w:t xml:space="preserve"> </w:t>
-      </w:r>
-      <w:r>
-        <w:t>к</w:t>
-      </w:r>
-      <w:r>
-        <w:rPr>
-          <w:lang w:val="en-US"/>
-        </w:rPr>
-        <w:t xml:space="preserve"> </w:t>
-      </w:r>
-      <w:r>
-        <w:rPr>
-          <w:lang w:val="en-US"/>
-        </w:rPr>
-        <w:t>CWE</w:t>
-      </w:r>
-      <w:r>
-        <w:rPr>
-          <w:lang w:val="en-US"/>
-        </w:rPr>
-        <w:t>-</w:t>
-      </w:r>
-      <w:r>
-        <w:rPr>
-          <w:lang w:val="en-US"/>
-        </w:rPr>
-        <w:t xml:space="preserve">693. </w:t>
-      </w:r>
-      <w:proofErr w:type="gramStart"/>
-      <w:r>
-        <w:rPr>
-          <w:lang w:val="en-US"/>
-        </w:rPr>
-        <w:t>Header</w:t>
-      </w:r>
-      <w:r>
-        <w:t xml:space="preserve"> </w:t>
-      </w:r>
-      <w:r>
-        <w:t>с</w:t>
-      </w:r>
-      <w:r>
-        <w:t xml:space="preserve"> </w:t>
-      </w:r>
-      <w:r>
-        <w:t>параметром</w:t>
-      </w:r>
-      <w:r>
-        <w:t xml:space="preserve"> </w:t>
-      </w:r>
-      <w:r>
-        <w:rPr>
-          <w:lang w:val="en-US"/>
-        </w:rPr>
-        <w:t>x</w:t>
-      </w:r>
-      <w:r>
-        <w:t>-</w:t>
-      </w:r>
-      <w:r>
-        <w:rPr>
-          <w:lang w:val="en-US"/>
-        </w:rPr>
-        <w:t>frame</w:t>
-      </w:r>
-      <w:r>
-        <w:t>-</w:t>
-      </w:r>
-      <w:r>
-        <w:rPr>
-          <w:lang w:val="en-US"/>
-        </w:rPr>
-        <w:t>options</w:t>
-      </w:r>
-      <w:proofErr w:type="gramEnd"/>
-      <w:r>
-        <w:t xml:space="preserve"> – </w:t>
-      </w:r>
-      <w:r>
-        <w:rPr>
-          <w:lang w:val="en-US"/>
-        </w:rPr>
-        <w:t>CVE</w:t>
-      </w:r>
-      <w:r>
-        <w:t>-2206-</w:t>
-      </w:r>
-      <w:r>
-        <w:t xml:space="preserve">4 </w:t>
-      </w:r>
-      <w:r>
-        <w:t>относится</w:t>
-      </w:r>
-      <w:r>
-        <w:t xml:space="preserve"> </w:t>
-      </w:r>
-      <w:r>
-        <w:t>к</w:t>
-      </w:r>
-      <w:r>
-        <w:t xml:space="preserve"> </w:t>
-      </w:r>
-      <w:r>
-        <w:rPr>
-          <w:lang w:val="en-US"/>
-        </w:rPr>
-        <w:t>CWE</w:t>
-      </w:r>
-      <w:r>
-        <w:t>-</w:t>
-      </w:r>
-      <w:r>
-        <w:t xml:space="preserve">1021. </w:t>
-      </w:r>
-    </w:p>
-    <w:p>
-      <w:pPr>
-        <w:ind w:firstLine="708"/>
-        <w:jc w:val="both"/>
-      </w:pPr>
-      <w:r>
-        <w:t xml:space="preserve">Далее оценим критичность риска </w:t>
-      </w:r>
-      <w:r>
-        <w:rPr>
-          <w:lang w:val="en-US"/>
-        </w:rPr>
-        <w:t>CVSS</w:t>
-      </w:r>
-      <w:r>
-        <w:t>:</w:t>
-      </w:r>
-    </w:p>
-    <w:p>
-      <w:pPr>
-        <w:ind w:firstLine="708"/>
-        <w:jc w:val="both"/>
         <w:rPr>
           <w:rFonts w:ascii="Times New Roman" w:hAnsi="Times New Roman" w:cs="Times New Roman"/>
           <w:b/>
@@ -783,7 +724,7 @@
           <w:sz w:val="28"/>
           <w:lang w:val="en-US"/>
         </w:rPr>
-        <w:t>CVE</w:t>
+        <w:t xml:space="preserve">InnerHTML </w:t>
       </w:r>
       <w:r>
         <w:rPr>
@@ -791,7 +732,7 @@
           <w:b/>
           <w:sz w:val="28"/>
         </w:rPr>
-        <w:t>-2026-1 (</w:t>
+        <w:t>(</w:t>
       </w:r>
       <w:r>
         <w:rPr>
@@ -1365,9 +1306,18 @@
           <w:rFonts w:ascii="Times New Roman" w:eastAsia="Times New Roman" w:hAnsi="Times New Roman" w:cs="Times New Roman"/>
           <w:sz w:val="24"/>
           <w:szCs w:val="24"/>
-          <w:lang w:eastAsia="ru-RU"/>
-        </w:rPr>
-        <w:t xml:space="preserve"> — </w:t>
+          <w:lang w:val="en-US" w:eastAsia="ru-RU"/>
+        </w:rPr>
+        <w:t>:</w:t>
+      </w:r>
+      <w:r>
+        <w:rPr>
+          <w:rFonts w:ascii="Times New Roman" w:eastAsia="Times New Roman" w:hAnsi="Times New Roman" w:cs="Times New Roman"/>
+          <w:sz w:val="24"/>
+          <w:szCs w:val="24"/>
+          <w:lang w:eastAsia="ru-RU"/>
+        </w:rPr>
+        <w:t xml:space="preserve"> </w:t>
       </w:r>
       <w:r>
         <w:rPr>
@@ -1423,9 +1373,18 @@
           <w:rFonts w:ascii="Times New Roman" w:eastAsia="Times New Roman" w:hAnsi="Times New Roman" w:cs="Times New Roman"/>
           <w:sz w:val="24"/>
           <w:szCs w:val="24"/>
-          <w:lang w:eastAsia="ru-RU"/>
-        </w:rPr>
-        <w:t xml:space="preserve"> — </w:t>
+          <w:lang w:val="en-US" w:eastAsia="ru-RU"/>
+        </w:rPr>
+        <w:t>:</w:t>
+      </w:r>
+      <w:r>
+        <w:rPr>
+          <w:rFonts w:ascii="Times New Roman" w:eastAsia="Times New Roman" w:hAnsi="Times New Roman" w:cs="Times New Roman"/>
+          <w:sz w:val="24"/>
+          <w:szCs w:val="24"/>
+          <w:lang w:eastAsia="ru-RU"/>
+        </w:rPr>
+        <w:t xml:space="preserve"> </w:t>
       </w:r>
       <w:r>
         <w:rPr>
@@ -1540,91 +1499,64 @@
     </w:p>
     <w:p>
       <w:pPr>
-        <w:jc w:val="both"/>
-        <w:rPr>
-          <w:lang w:val="en-US"/>
-        </w:rPr>
-      </w:pPr>
-    </w:p>
-    <w:p>
-      <w:pPr>
         <w:ind w:firstLine="708"/>
         <w:jc w:val="both"/>
         <w:rPr>
           <w:rFonts w:ascii="Times New Roman" w:hAnsi="Times New Roman" w:cs="Times New Roman"/>
           <w:b/>
           <w:sz w:val="28"/>
-          <w:lang w:val="en-US"/>
-        </w:rPr>
-      </w:pPr>
+          <w:highlight w:val="yellow"/>
+          <w:lang w:val="en-US"/>
+        </w:rPr>
+      </w:pPr>
+      <w:proofErr w:type="gramStart"/>
       <w:r>
         <w:rPr>
           <w:rFonts w:ascii="Times New Roman" w:hAnsi="Times New Roman" w:cs="Times New Roman"/>
           <w:b/>
           <w:sz w:val="28"/>
-          <w:lang w:val="en-US"/>
-        </w:rPr>
-        <w:t>CVE</w:t>
-      </w:r>
+          <w:highlight w:val="yellow"/>
+          <w:lang w:val="en-US"/>
+        </w:rPr>
+        <w:t>x-frame-options</w:t>
+      </w:r>
+      <w:proofErr w:type="gramEnd"/>
       <w:r>
         <w:rPr>
           <w:rFonts w:ascii="Times New Roman" w:hAnsi="Times New Roman" w:cs="Times New Roman"/>
           <w:b/>
           <w:sz w:val="28"/>
-          <w:lang w:val="en-US"/>
-        </w:rPr>
-        <w:t>-2026-</w:t>
+          <w:highlight w:val="yellow"/>
+          <w:lang w:val="en-US"/>
+        </w:rPr>
+        <w:t xml:space="preserve"> </w:t>
       </w:r>
       <w:r>
         <w:rPr>
           <w:rFonts w:ascii="Times New Roman" w:hAnsi="Times New Roman" w:cs="Times New Roman"/>
           <w:b/>
           <w:sz w:val="28"/>
-          <w:lang w:val="en-US"/>
-        </w:rPr>
-        <w:t>2</w:t>
+          <w:highlight w:val="yellow"/>
+          <w:lang w:val="en-US"/>
+        </w:rPr>
+        <w:t>(CWE-</w:t>
       </w:r>
       <w:r>
         <w:rPr>
           <w:rFonts w:ascii="Times New Roman" w:hAnsi="Times New Roman" w:cs="Times New Roman"/>
           <w:b/>
           <w:sz w:val="28"/>
-          <w:lang w:val="en-US"/>
-        </w:rPr>
-        <w:t xml:space="preserve"> (</w:t>
+          <w:highlight w:val="yellow"/>
+          <w:lang w:val="en-US"/>
+        </w:rPr>
+        <w:t>1021</w:t>
       </w:r>
       <w:r>
         <w:rPr>
           <w:rFonts w:ascii="Times New Roman" w:hAnsi="Times New Roman" w:cs="Times New Roman"/>
           <w:b/>
           <w:sz w:val="28"/>
-          <w:lang w:val="en-US"/>
-        </w:rPr>
-        <w:t>CWE</w:t>
-      </w:r>
-      <w:r>
-        <w:rPr>
-          <w:rFonts w:ascii="Times New Roman" w:hAnsi="Times New Roman" w:cs="Times New Roman"/>
-          <w:b/>
-          <w:sz w:val="28"/>
-          <w:lang w:val="en-US"/>
-        </w:rPr>
-        <w:t>-</w:t>
-      </w:r>
-      <w:r>
-        <w:rPr>
-          <w:rFonts w:ascii="Times New Roman" w:hAnsi="Times New Roman" w:cs="Times New Roman"/>
-          <w:b/>
-          <w:sz w:val="28"/>
-          <w:lang w:val="en-US"/>
-        </w:rPr>
-        <w:t>693</w:t>
-      </w:r>
-      <w:r>
-        <w:rPr>
-          <w:rFonts w:ascii="Times New Roman" w:hAnsi="Times New Roman" w:cs="Times New Roman"/>
-          <w:b/>
-          <w:sz w:val="28"/>
+          <w:highlight w:val="yellow"/>
           <w:lang w:val="en-US"/>
         </w:rPr>
         <w:t>)</w:t>
@@ -1638,22 +1570,28 @@
         <w:rPr>
           <w:b/>
           <w:bCs/>
-          <w:lang w:val="en-US"/>
-        </w:rPr>
-      </w:pPr>
-      <w:r>
+          <w:highlight w:val="yellow"/>
+          <w:lang w:val="en-US"/>
+        </w:rPr>
+      </w:pPr>
+      <w:r>
+        <w:rPr>
+          <w:highlight w:val="yellow"/>
+        </w:rPr>
         <w:t>Рассмотрим</w:t>
       </w:r>
       <w:r>
         <w:rPr>
-          <w:lang w:val="en-US"/>
-        </w:rPr>
-        <w:t xml:space="preserve"> </w:t>
-      </w:r>
-      <w:r>
-        <w:rPr>
-          <w:b/>
-          <w:bCs/>
+          <w:highlight w:val="yellow"/>
+          <w:lang w:val="en-US"/>
+        </w:rPr>
+        <w:t xml:space="preserve"> </w:t>
+      </w:r>
+      <w:r>
+        <w:rPr>
+          <w:b/>
+          <w:bCs/>
+          <w:highlight w:val="yellow"/>
           <w:lang w:val="en-US"/>
         </w:rPr>
         <w:t xml:space="preserve">Base Score: </w:t>
@@ -1672,6 +1610,7 @@
           <w:rFonts w:ascii="Times New Roman" w:eastAsia="Times New Roman" w:hAnsi="Times New Roman" w:cs="Times New Roman"/>
           <w:sz w:val="24"/>
           <w:szCs w:val="24"/>
+          <w:highlight w:val="yellow"/>
           <w:lang w:eastAsia="ru-RU"/>
         </w:rPr>
       </w:pPr>
@@ -1683,6 +1622,7 @@
           <w:bCs/>
           <w:sz w:val="24"/>
           <w:szCs w:val="24"/>
+          <w:highlight w:val="yellow"/>
           <w:lang w:eastAsia="ru-RU"/>
         </w:rPr>
         <w:t>Attack</w:t>
@@ -1695,6 +1635,7 @@
           <w:bCs/>
           <w:sz w:val="24"/>
           <w:szCs w:val="24"/>
+          <w:highlight w:val="yellow"/>
           <w:lang w:eastAsia="ru-RU"/>
         </w:rPr>
         <w:t xml:space="preserve"> </w:t>
@@ -1707,6 +1648,7 @@
           <w:bCs/>
           <w:sz w:val="24"/>
           <w:szCs w:val="24"/>
+          <w:highlight w:val="yellow"/>
           <w:lang w:eastAsia="ru-RU"/>
         </w:rPr>
         <w:t>Vector</w:t>
@@ -1719,6 +1661,7 @@
           <w:bCs/>
           <w:sz w:val="24"/>
           <w:szCs w:val="24"/>
+          <w:highlight w:val="yellow"/>
           <w:lang w:eastAsia="ru-RU"/>
         </w:rPr>
         <w:t xml:space="preserve"> (AV)</w:t>
@@ -1728,6 +1671,7 @@
           <w:rFonts w:ascii="Times New Roman" w:eastAsia="Times New Roman" w:hAnsi="Times New Roman" w:cs="Times New Roman"/>
           <w:sz w:val="24"/>
           <w:szCs w:val="24"/>
+          <w:highlight w:val="yellow"/>
           <w:lang w:eastAsia="ru-RU"/>
         </w:rPr>
         <w:t>: Сеть</w:t>
@@ -1745,7 +1689,7 @@
           <w:rFonts w:ascii="Times New Roman" w:eastAsia="Times New Roman" w:hAnsi="Times New Roman" w:cs="Times New Roman"/>
           <w:sz w:val="24"/>
           <w:szCs w:val="24"/>
-          <w:highlight w:val="red"/>
+          <w:highlight w:val="yellow"/>
           <w:lang w:eastAsia="ru-RU"/>
         </w:rPr>
       </w:pPr>
@@ -1757,7 +1701,7 @@
           <w:bCs/>
           <w:sz w:val="24"/>
           <w:szCs w:val="24"/>
-          <w:highlight w:val="red"/>
+          <w:highlight w:val="yellow"/>
           <w:lang w:eastAsia="ru-RU"/>
         </w:rPr>
         <w:t>Attack</w:t>
@@ -1770,7 +1714,7 @@
           <w:bCs/>
           <w:sz w:val="24"/>
           <w:szCs w:val="24"/>
-          <w:highlight w:val="red"/>
+          <w:highlight w:val="yellow"/>
           <w:lang w:eastAsia="ru-RU"/>
         </w:rPr>
         <w:t xml:space="preserve"> </w:t>
@@ -1783,7 +1727,7 @@
           <w:bCs/>
           <w:sz w:val="24"/>
           <w:szCs w:val="24"/>
-          <w:highlight w:val="red"/>
+          <w:highlight w:val="yellow"/>
           <w:lang w:eastAsia="ru-RU"/>
         </w:rPr>
         <w:t>Complexity</w:t>
@@ -1796,7 +1740,7 @@
           <w:bCs/>
           <w:sz w:val="24"/>
           <w:szCs w:val="24"/>
-          <w:highlight w:val="red"/>
+          <w:highlight w:val="yellow"/>
           <w:lang w:eastAsia="ru-RU"/>
         </w:rPr>
         <w:t xml:space="preserve"> (AC)</w:t>
@@ -1806,7 +1750,7 @@
           <w:rFonts w:ascii="Times New Roman" w:eastAsia="Times New Roman" w:hAnsi="Times New Roman" w:cs="Times New Roman"/>
           <w:sz w:val="24"/>
           <w:szCs w:val="24"/>
-          <w:highlight w:val="red"/>
+          <w:highlight w:val="yellow"/>
           <w:lang w:eastAsia="ru-RU"/>
         </w:rPr>
         <w:t>:</w:t>
@@ -1816,17 +1760,17 @@
           <w:rFonts w:ascii="Times New Roman" w:eastAsia="Times New Roman" w:hAnsi="Times New Roman" w:cs="Times New Roman"/>
           <w:sz w:val="24"/>
           <w:szCs w:val="24"/>
-          <w:highlight w:val="red"/>
-          <w:lang w:eastAsia="ru-RU"/>
-        </w:rPr>
-        <w:t xml:space="preserve"> </w:t>
-      </w:r>
-      <w:r>
-        <w:rPr>
-          <w:rFonts w:ascii="Times New Roman" w:eastAsia="Times New Roman" w:hAnsi="Times New Roman" w:cs="Times New Roman"/>
-          <w:sz w:val="24"/>
-          <w:szCs w:val="24"/>
-          <w:highlight w:val="red"/>
+          <w:highlight w:val="yellow"/>
+          <w:lang w:eastAsia="ru-RU"/>
+        </w:rPr>
+        <w:t xml:space="preserve"> </w:t>
+      </w:r>
+      <w:r>
+        <w:rPr>
+          <w:rFonts w:ascii="Times New Roman" w:eastAsia="Times New Roman" w:hAnsi="Times New Roman" w:cs="Times New Roman"/>
+          <w:sz w:val="24"/>
+          <w:szCs w:val="24"/>
+          <w:highlight w:val="yellow"/>
           <w:lang w:eastAsia="ru-RU"/>
         </w:rPr>
         <w:t>Легкая</w:t>
@@ -1844,7 +1788,7 @@
           <w:rFonts w:ascii="Times New Roman" w:eastAsia="Times New Roman" w:hAnsi="Times New Roman" w:cs="Times New Roman"/>
           <w:sz w:val="24"/>
           <w:szCs w:val="24"/>
-          <w:highlight w:val="red"/>
+          <w:highlight w:val="yellow"/>
           <w:lang w:eastAsia="ru-RU"/>
         </w:rPr>
       </w:pPr>
@@ -1856,7 +1800,7 @@
           <w:bCs/>
           <w:sz w:val="24"/>
           <w:szCs w:val="24"/>
-          <w:highlight w:val="red"/>
+          <w:highlight w:val="yellow"/>
           <w:lang w:eastAsia="ru-RU"/>
         </w:rPr>
         <w:t>Privileges</w:t>
@@ -1869,7 +1813,7 @@
           <w:bCs/>
           <w:sz w:val="24"/>
           <w:szCs w:val="24"/>
-          <w:highlight w:val="red"/>
+          <w:highlight w:val="yellow"/>
           <w:lang w:eastAsia="ru-RU"/>
         </w:rPr>
         <w:t xml:space="preserve"> </w:t>
@@ -1882,7 +1826,7 @@
           <w:bCs/>
           <w:sz w:val="24"/>
           <w:szCs w:val="24"/>
-          <w:highlight w:val="red"/>
+          <w:highlight w:val="yellow"/>
           <w:lang w:eastAsia="ru-RU"/>
         </w:rPr>
         <w:t>Required</w:t>
@@ -1895,7 +1839,7 @@
           <w:bCs/>
           <w:sz w:val="24"/>
           <w:szCs w:val="24"/>
-          <w:highlight w:val="red"/>
+          <w:highlight w:val="yellow"/>
           <w:lang w:eastAsia="ru-RU"/>
         </w:rPr>
         <w:t xml:space="preserve"> (PR)</w:t>
@@ -1905,10 +1849,22 @@
           <w:rFonts w:ascii="Times New Roman" w:eastAsia="Times New Roman" w:hAnsi="Times New Roman" w:cs="Times New Roman"/>
           <w:sz w:val="24"/>
           <w:szCs w:val="24"/>
-          <w:highlight w:val="red"/>
-          <w:lang w:eastAsia="ru-RU"/>
-        </w:rPr>
-        <w:t>: Нет</w:t>
+          <w:highlight w:val="yellow"/>
+          <w:lang w:eastAsia="ru-RU"/>
+        </w:rPr>
+        <w:t>: Не</w:t>
+      </w:r>
+      <w:bookmarkStart w:id="0" w:name="_GoBack"/>
+      <w:bookmarkEnd w:id="0"/>
+      <w:r>
+        <w:rPr>
+          <w:rFonts w:ascii="Times New Roman" w:eastAsia="Times New Roman" w:hAnsi="Times New Roman" w:cs="Times New Roman"/>
+          <w:sz w:val="24"/>
+          <w:szCs w:val="24"/>
+          <w:highlight w:val="yellow"/>
+          <w:lang w:eastAsia="ru-RU"/>
+        </w:rPr>
+        <w:t>т</w:t>
       </w:r>
     </w:p>
     <w:p>
@@ -1923,7 +1879,7 @@
           <w:rFonts w:ascii="Times New Roman" w:eastAsia="Times New Roman" w:hAnsi="Times New Roman" w:cs="Times New Roman"/>
           <w:sz w:val="24"/>
           <w:szCs w:val="24"/>
-          <w:highlight w:val="red"/>
+          <w:highlight w:val="yellow"/>
           <w:lang w:eastAsia="ru-RU"/>
         </w:rPr>
       </w:pPr>
@@ -1935,7 +1891,7 @@
           <w:bCs/>
           <w:sz w:val="24"/>
           <w:szCs w:val="24"/>
-          <w:highlight w:val="red"/>
+          <w:highlight w:val="yellow"/>
           <w:lang w:eastAsia="ru-RU"/>
         </w:rPr>
         <w:t>User</w:t>
@@ -1948,7 +1904,7 @@
           <w:bCs/>
           <w:sz w:val="24"/>
           <w:szCs w:val="24"/>
-          <w:highlight w:val="red"/>
+          <w:highlight w:val="yellow"/>
           <w:lang w:eastAsia="ru-RU"/>
         </w:rPr>
         <w:t xml:space="preserve"> </w:t>
@@ -1961,7 +1917,7 @@
           <w:bCs/>
           <w:sz w:val="24"/>
           <w:szCs w:val="24"/>
-          <w:highlight w:val="red"/>
+          <w:highlight w:val="yellow"/>
           <w:lang w:eastAsia="ru-RU"/>
         </w:rPr>
         <w:t>Interaction</w:t>
@@ -1974,7 +1930,7 @@
           <w:bCs/>
           <w:sz w:val="24"/>
           <w:szCs w:val="24"/>
-          <w:highlight w:val="red"/>
+          <w:highlight w:val="yellow"/>
           <w:lang w:eastAsia="ru-RU"/>
         </w:rPr>
         <w:t xml:space="preserve"> (UI)</w:t>
@@ -1984,7 +1940,7 @@
           <w:rFonts w:ascii="Times New Roman" w:eastAsia="Times New Roman" w:hAnsi="Times New Roman" w:cs="Times New Roman"/>
           <w:sz w:val="24"/>
           <w:szCs w:val="24"/>
-          <w:highlight w:val="red"/>
+          <w:highlight w:val="yellow"/>
           <w:lang w:eastAsia="ru-RU"/>
         </w:rPr>
         <w:t>: Да</w:t>
@@ -2002,7 +1958,7 @@
           <w:rFonts w:ascii="Times New Roman" w:eastAsia="Times New Roman" w:hAnsi="Times New Roman" w:cs="Times New Roman"/>
           <w:sz w:val="24"/>
           <w:szCs w:val="24"/>
-          <w:highlight w:val="red"/>
+          <w:highlight w:val="yellow"/>
           <w:lang w:eastAsia="ru-RU"/>
         </w:rPr>
       </w:pPr>
@@ -2014,7 +1970,7 @@
           <w:bCs/>
           <w:sz w:val="24"/>
           <w:szCs w:val="24"/>
-          <w:highlight w:val="red"/>
+          <w:highlight w:val="yellow"/>
           <w:lang w:eastAsia="ru-RU"/>
         </w:rPr>
         <w:t>Scope</w:t>
@@ -2027,7 +1983,7 @@
           <w:bCs/>
           <w:sz w:val="24"/>
           <w:szCs w:val="24"/>
-          <w:highlight w:val="red"/>
+          <w:highlight w:val="yellow"/>
           <w:lang w:eastAsia="ru-RU"/>
         </w:rPr>
         <w:t xml:space="preserve"> (S)</w:t>
@@ -2037,7 +1993,7 @@
           <w:rFonts w:ascii="Times New Roman" w:eastAsia="Times New Roman" w:hAnsi="Times New Roman" w:cs="Times New Roman"/>
           <w:sz w:val="24"/>
           <w:szCs w:val="24"/>
-          <w:highlight w:val="red"/>
+          <w:highlight w:val="yellow"/>
           <w:lang w:eastAsia="ru-RU"/>
         </w:rPr>
         <w:t xml:space="preserve">: </w:t>
@@ -2048,10 +2004,20 @@
           <w:rFonts w:ascii="Times New Roman" w:eastAsia="Times New Roman" w:hAnsi="Times New Roman" w:cs="Times New Roman"/>
           <w:sz w:val="24"/>
           <w:szCs w:val="24"/>
-          <w:highlight w:val="red"/>
-          <w:lang w:eastAsia="ru-RU"/>
-        </w:rPr>
-        <w:t>Changed</w:t>
+          <w:highlight w:val="yellow"/>
+          <w:lang w:val="en-US" w:eastAsia="ru-RU"/>
+        </w:rPr>
+        <w:t>Unc</w:t>
+      </w:r>
+      <w:r>
+        <w:rPr>
+          <w:rFonts w:ascii="Times New Roman" w:eastAsia="Times New Roman" w:hAnsi="Times New Roman" w:cs="Times New Roman"/>
+          <w:sz w:val="24"/>
+          <w:szCs w:val="24"/>
+          <w:highlight w:val="yellow"/>
+          <w:lang w:eastAsia="ru-RU"/>
+        </w:rPr>
+        <w:t>hanged</w:t>
       </w:r>
       <w:proofErr w:type="spellEnd"/>
     </w:p>
@@ -2067,7 +2033,7 @@
           <w:rFonts w:ascii="Times New Roman" w:eastAsia="Times New Roman" w:hAnsi="Times New Roman" w:cs="Times New Roman"/>
           <w:sz w:val="24"/>
           <w:szCs w:val="24"/>
-          <w:highlight w:val="red"/>
+          <w:highlight w:val="yellow"/>
           <w:lang w:eastAsia="ru-RU"/>
         </w:rPr>
       </w:pPr>
@@ -2079,7 +2045,7 @@
           <w:bCs/>
           <w:sz w:val="24"/>
           <w:szCs w:val="24"/>
-          <w:highlight w:val="red"/>
+          <w:highlight w:val="yellow"/>
           <w:lang w:eastAsia="ru-RU"/>
         </w:rPr>
         <w:t>Confidentiality</w:t>
@@ -2092,7 +2058,7 @@
           <w:bCs/>
           <w:sz w:val="24"/>
           <w:szCs w:val="24"/>
-          <w:highlight w:val="red"/>
+          <w:highlight w:val="yellow"/>
           <w:lang w:eastAsia="ru-RU"/>
         </w:rPr>
         <w:t xml:space="preserve"> (C)</w:t>
@@ -2102,10 +2068,20 @@
           <w:rFonts w:ascii="Times New Roman" w:eastAsia="Times New Roman" w:hAnsi="Times New Roman" w:cs="Times New Roman"/>
           <w:sz w:val="24"/>
           <w:szCs w:val="24"/>
-          <w:highlight w:val="red"/>
-          <w:lang w:eastAsia="ru-RU"/>
-        </w:rPr>
-        <w:t>: Низкая</w:t>
+          <w:highlight w:val="yellow"/>
+          <w:lang w:eastAsia="ru-RU"/>
+        </w:rPr>
+        <w:t xml:space="preserve">: </w:t>
+      </w:r>
+      <w:r>
+        <w:rPr>
+          <w:rFonts w:ascii="Times New Roman" w:eastAsia="Times New Roman" w:hAnsi="Times New Roman" w:cs="Times New Roman"/>
+          <w:sz w:val="24"/>
+          <w:szCs w:val="24"/>
+          <w:highlight w:val="yellow"/>
+          <w:lang w:eastAsia="ru-RU"/>
+        </w:rPr>
+        <w:t>Никакого</w:t>
       </w:r>
     </w:p>
     <w:p>
@@ -2120,7 +2096,7 @@
           <w:rFonts w:ascii="Times New Roman" w:eastAsia="Times New Roman" w:hAnsi="Times New Roman" w:cs="Times New Roman"/>
           <w:sz w:val="24"/>
           <w:szCs w:val="24"/>
-          <w:highlight w:val="red"/>
+          <w:highlight w:val="yellow"/>
           <w:lang w:eastAsia="ru-RU"/>
         </w:rPr>
       </w:pPr>
@@ -2132,7 +2108,7 @@
           <w:bCs/>
           <w:sz w:val="24"/>
           <w:szCs w:val="24"/>
-          <w:highlight w:val="red"/>
+          <w:highlight w:val="yellow"/>
           <w:lang w:eastAsia="ru-RU"/>
         </w:rPr>
         <w:t>Integrity</w:t>
@@ -2145,7 +2121,7 @@
           <w:bCs/>
           <w:sz w:val="24"/>
           <w:szCs w:val="24"/>
-          <w:highlight w:val="red"/>
+          <w:highlight w:val="yellow"/>
           <w:lang w:eastAsia="ru-RU"/>
         </w:rPr>
         <w:t xml:space="preserve"> (I)</w:t>
@@ -2155,7 +2131,7 @@
           <w:rFonts w:ascii="Times New Roman" w:eastAsia="Times New Roman" w:hAnsi="Times New Roman" w:cs="Times New Roman"/>
           <w:sz w:val="24"/>
           <w:szCs w:val="24"/>
-          <w:highlight w:val="red"/>
+          <w:highlight w:val="yellow"/>
           <w:lang w:eastAsia="ru-RU"/>
         </w:rPr>
         <w:t xml:space="preserve"> — </w:t>
@@ -2165,10 +2141,10 @@
           <w:rFonts w:ascii="Times New Roman" w:eastAsia="Times New Roman" w:hAnsi="Times New Roman" w:cs="Times New Roman"/>
           <w:sz w:val="24"/>
           <w:szCs w:val="24"/>
-          <w:highlight w:val="red"/>
-          <w:lang w:eastAsia="ru-RU"/>
-        </w:rPr>
-        <w:t>Низкая</w:t>
+          <w:highlight w:val="yellow"/>
+          <w:lang w:eastAsia="ru-RU"/>
+        </w:rPr>
+        <w:t>Никакого</w:t>
       </w:r>
     </w:p>
     <w:p>
@@ -2183,7 +2159,7 @@
           <w:rFonts w:ascii="Times New Roman" w:eastAsia="Times New Roman" w:hAnsi="Times New Roman" w:cs="Times New Roman"/>
           <w:sz w:val="24"/>
           <w:szCs w:val="24"/>
-          <w:highlight w:val="red"/>
+          <w:highlight w:val="yellow"/>
           <w:lang w:eastAsia="ru-RU"/>
         </w:rPr>
       </w:pPr>
@@ -2195,7 +2171,7 @@
           <w:bCs/>
           <w:sz w:val="24"/>
           <w:szCs w:val="24"/>
-          <w:highlight w:val="red"/>
+          <w:highlight w:val="yellow"/>
           <w:lang w:eastAsia="ru-RU"/>
         </w:rPr>
         <w:t>Availability</w:t>
@@ -2208,7 +2184,7 @@
           <w:bCs/>
           <w:sz w:val="24"/>
           <w:szCs w:val="24"/>
-          <w:highlight w:val="red"/>
+          <w:highlight w:val="yellow"/>
           <w:lang w:eastAsia="ru-RU"/>
         </w:rPr>
         <w:t xml:space="preserve"> (A)</w:t>
@@ -2218,7 +2194,7 @@
           <w:rFonts w:ascii="Times New Roman" w:eastAsia="Times New Roman" w:hAnsi="Times New Roman" w:cs="Times New Roman"/>
           <w:sz w:val="24"/>
           <w:szCs w:val="24"/>
-          <w:highlight w:val="red"/>
+          <w:highlight w:val="yellow"/>
           <w:lang w:eastAsia="ru-RU"/>
         </w:rPr>
         <w:t xml:space="preserve"> — </w:t>
@@ -2228,7 +2204,7 @@
           <w:rFonts w:ascii="Times New Roman" w:eastAsia="Times New Roman" w:hAnsi="Times New Roman" w:cs="Times New Roman"/>
           <w:sz w:val="24"/>
           <w:szCs w:val="24"/>
-          <w:highlight w:val="red"/>
+          <w:highlight w:val="yellow"/>
           <w:lang w:eastAsia="ru-RU"/>
         </w:rPr>
         <w:t>Низкая</w:t>
@@ -2244,21 +2220,20 @@
           <w:bCs/>
           <w:sz w:val="24"/>
           <w:szCs w:val="24"/>
-          <w:highlight w:val="red"/>
-          <w:lang w:eastAsia="ru-RU"/>
-        </w:rPr>
-      </w:pPr>
-      <w:r>
-        <w:rPr>
-          <w:rFonts w:ascii="Times New Roman" w:eastAsia="Times New Roman" w:hAnsi="Times New Roman" w:cs="Times New Roman"/>
-          <w:b/>
-          <w:bCs/>
-          <w:sz w:val="24"/>
-          <w:szCs w:val="24"/>
-          <w:highlight w:val="red"/>
-          <w:lang w:eastAsia="ru-RU"/>
-        </w:rPr>
-        <w:lastRenderedPageBreak/>
+          <w:highlight w:val="yellow"/>
+          <w:lang w:eastAsia="ru-RU"/>
+        </w:rPr>
+      </w:pPr>
+      <w:r>
+        <w:rPr>
+          <w:rFonts w:ascii="Times New Roman" w:eastAsia="Times New Roman" w:hAnsi="Times New Roman" w:cs="Times New Roman"/>
+          <w:b/>
+          <w:bCs/>
+          <w:sz w:val="24"/>
+          <w:szCs w:val="24"/>
+          <w:highlight w:val="yellow"/>
+          <w:lang w:eastAsia="ru-RU"/>
+        </w:rPr>
         <w:t xml:space="preserve">Значение получилось в онлайн калькуляторе </w:t>
       </w:r>
       <w:r>
@@ -2268,7 +2243,7 @@
           <w:bCs/>
           <w:sz w:val="24"/>
           <w:szCs w:val="24"/>
-          <w:highlight w:val="red"/>
+          <w:highlight w:val="yellow"/>
           <w:lang w:val="en-US" w:eastAsia="ru-RU"/>
         </w:rPr>
         <w:t>CVSS</w:t>
@@ -2280,31 +2255,91 @@
           <w:bCs/>
           <w:sz w:val="24"/>
           <w:szCs w:val="24"/>
-          <w:highlight w:val="red"/>
-          <w:lang w:eastAsia="ru-RU"/>
-        </w:rPr>
-        <w:t xml:space="preserve"> 3.1 = 7.1 (</w:t>
-      </w:r>
-      <w:r>
-        <w:rPr>
-          <w:rFonts w:ascii="Times New Roman" w:eastAsia="Times New Roman" w:hAnsi="Times New Roman" w:cs="Times New Roman"/>
-          <w:b/>
-          <w:bCs/>
-          <w:sz w:val="24"/>
-          <w:szCs w:val="24"/>
-          <w:highlight w:val="red"/>
+          <w:highlight w:val="yellow"/>
+          <w:lang w:eastAsia="ru-RU"/>
+        </w:rPr>
+        <w:t xml:space="preserve"> 3.1 = </w:t>
+      </w:r>
+      <w:r>
+        <w:rPr>
+          <w:rFonts w:ascii="Times New Roman" w:eastAsia="Times New Roman" w:hAnsi="Times New Roman" w:cs="Times New Roman"/>
+          <w:b/>
+          <w:bCs/>
+          <w:sz w:val="24"/>
+          <w:szCs w:val="24"/>
+          <w:highlight w:val="yellow"/>
+          <w:lang w:eastAsia="ru-RU"/>
+        </w:rPr>
+        <w:t>4</w:t>
+      </w:r>
+      <w:r>
+        <w:rPr>
+          <w:rFonts w:ascii="Times New Roman" w:eastAsia="Times New Roman" w:hAnsi="Times New Roman" w:cs="Times New Roman"/>
+          <w:b/>
+          <w:bCs/>
+          <w:sz w:val="24"/>
+          <w:szCs w:val="24"/>
+          <w:highlight w:val="yellow"/>
+          <w:lang w:eastAsia="ru-RU"/>
+        </w:rPr>
+        <w:t>.</w:t>
+      </w:r>
+      <w:r>
+        <w:rPr>
+          <w:rFonts w:ascii="Times New Roman" w:eastAsia="Times New Roman" w:hAnsi="Times New Roman" w:cs="Times New Roman"/>
+          <w:b/>
+          <w:bCs/>
+          <w:sz w:val="24"/>
+          <w:szCs w:val="24"/>
+          <w:highlight w:val="yellow"/>
+          <w:lang w:eastAsia="ru-RU"/>
+        </w:rPr>
+        <w:t>3</w:t>
+      </w:r>
+      <w:r>
+        <w:rPr>
+          <w:rFonts w:ascii="Times New Roman" w:eastAsia="Times New Roman" w:hAnsi="Times New Roman" w:cs="Times New Roman"/>
+          <w:b/>
+          <w:bCs/>
+          <w:sz w:val="24"/>
+          <w:szCs w:val="24"/>
+          <w:highlight w:val="yellow"/>
+          <w:lang w:eastAsia="ru-RU"/>
+        </w:rPr>
+        <w:t xml:space="preserve"> (</w:t>
+      </w:r>
+      <w:r>
+        <w:rPr>
+          <w:rFonts w:ascii="Times New Roman" w:eastAsia="Times New Roman" w:hAnsi="Times New Roman" w:cs="Times New Roman"/>
+          <w:b/>
+          <w:bCs/>
+          <w:sz w:val="24"/>
+          <w:szCs w:val="24"/>
+          <w:highlight w:val="yellow"/>
           <w:lang w:val="en-US" w:eastAsia="ru-RU"/>
         </w:rPr>
-        <w:t>High</w:t>
-      </w:r>
-      <w:r>
-        <w:rPr>
-          <w:rFonts w:ascii="Times New Roman" w:eastAsia="Times New Roman" w:hAnsi="Times New Roman" w:cs="Times New Roman"/>
-          <w:b/>
-          <w:bCs/>
-          <w:sz w:val="24"/>
-          <w:szCs w:val="24"/>
-          <w:highlight w:val="red"/>
+        <w:t>Med</w:t>
+      </w:r>
+      <w:r>
+        <w:rPr>
+          <w:rFonts w:ascii="Times New Roman" w:eastAsia="Times New Roman" w:hAnsi="Times New Roman" w:cs="Times New Roman"/>
+          <w:b/>
+          <w:bCs/>
+          <w:sz w:val="24"/>
+          <w:szCs w:val="24"/>
+          <w:highlight w:val="yellow"/>
+          <w:lang w:val="en-US" w:eastAsia="ru-RU"/>
+        </w:rPr>
+        <w:t>ium</w:t>
+      </w:r>
+      <w:r>
+        <w:rPr>
+          <w:rFonts w:ascii="Times New Roman" w:eastAsia="Times New Roman" w:hAnsi="Times New Roman" w:cs="Times New Roman"/>
+          <w:b/>
+          <w:bCs/>
+          <w:sz w:val="24"/>
+          <w:szCs w:val="24"/>
+          <w:highlight w:val="yellow"/>
           <w:lang w:eastAsia="ru-RU"/>
         </w:rPr>
         <w:t>)</w:t>
@@ -2312,62 +2347,21 @@
     </w:p>
     <w:p>
       <w:pPr>
-        <w:spacing w:before="100" w:beforeAutospacing="1" w:after="100" w:afterAutospacing="1" w:line="240" w:lineRule="auto"/>
         <w:jc w:val="both"/>
         <w:rPr>
-          <w:rFonts w:ascii="Times New Roman" w:eastAsia="Times New Roman" w:hAnsi="Times New Roman" w:cs="Times New Roman"/>
-          <w:sz w:val="24"/>
-          <w:szCs w:val="24"/>
+          <w:lang w:val="en-US"/>
+        </w:rPr>
+      </w:pPr>
+      <w:r>
+        <w:rPr>
+          <w:rFonts w:ascii="Times New Roman" w:eastAsia="Times New Roman" w:hAnsi="Times New Roman" w:cs="Times New Roman"/>
+          <w:sz w:val="24"/>
+          <w:szCs w:val="24"/>
+          <w:highlight w:val="yellow"/>
           <w:lang w:val="en-US" w:eastAsia="ru-RU"/>
         </w:rPr>
-      </w:pPr>
-      <w:r>
-        <w:rPr>
-          <w:rFonts w:ascii="Times New Roman" w:eastAsia="Times New Roman" w:hAnsi="Times New Roman" w:cs="Times New Roman"/>
-          <w:sz w:val="24"/>
-          <w:szCs w:val="24"/>
-          <w:highlight w:val="red"/>
-          <w:lang w:val="en-US" w:eastAsia="ru-RU"/>
-        </w:rPr>
-        <w:t>CVSS:3.1/AV:N/AC:L/PR:N/UI:R/S:C/C:L/I:L/A:L</w:t>
-      </w:r>
-      <w:bookmarkStart w:id="0" w:name="_GoBack"/>
-      <w:bookmarkEnd w:id="0"/>
-    </w:p>
-    <w:p>
-      <w:pPr>
-        <w:jc w:val="both"/>
-        <w:rPr>
-          <w:lang w:val="en-US"/>
-        </w:rPr>
-      </w:pPr>
-    </w:p>
-    <w:p>
-      <w:pPr>
-        <w:ind w:firstLine="708"/>
-        <w:jc w:val="both"/>
-        <w:rPr>
-          <w:lang w:val="en-US"/>
-        </w:rPr>
-      </w:pPr>
-    </w:p>
-    <w:p>
-      <w:pPr>
-        <w:ind w:firstLine="708"/>
-        <w:jc w:val="both"/>
-        <w:rPr>
-          <w:lang w:val="en-US"/>
-        </w:rPr>
-      </w:pPr>
-    </w:p>
-    <w:p>
-      <w:pPr>
-        <w:ind w:firstLine="708"/>
-        <w:jc w:val="both"/>
-        <w:rPr>
-          <w:lang w:val="en-US"/>
-        </w:rPr>
-      </w:pPr>
+        <w:t>CVSS:3.1/AV:N/AC:L/PR:N/UI:R/S:U/C:N/I:N/A:L</w:t>
+      </w:r>
     </w:p>
     <w:sectPr>
       <w:pgSz w:w="11906" w:h="16838"/>
@@ -3233,6 +3227,7 @@
   <w:style w:type="paragraph" w:default="1" w:styleId="a">
     <w:name w:val="Normal"/>
     <w:qFormat/>
+    <w:rsid w:val="00F4001E"/>
   </w:style>
   <w:style w:type="paragraph" w:styleId="4">
     <w:name w:val="heading 4"/>
@@ -3257,7 +3252,6 @@
   <w:style w:type="character" w:default="1" w:styleId="a0">
     <w:name w:val="Default Paragraph Font"/>
     <w:uiPriority w:val="1"/>
-    <w:semiHidden/>
     <w:unhideWhenUsed/>
   </w:style>
   <w:style w:type="table" w:default="1" w:styleId="a1">

</xml_diff>